<commit_message>
M.A. curriculum map: ensemble and capstone rows by units
Ensemble and MUS 693 Capstone rows read 4 units instead of four
semesters. FAST students take both in the two graduate-year semesters.

Co-Authored-By: Claude Opus 5.5 <noreply@anthropic.com>
Claude-Session: https://claude.ai/code/session_01XQos3pBa74xocoWCMXVKa2
</commit_message>
<xml_diff>
--- a/curriculum/ma/ma-music-curriculum-map.docx
+++ b/curriculum/ma/ma-music-curriculum-map.docx
@@ -3049,7 +3049,7 @@
                 <w:b w:val="0"/>
                 <w:sz w:val="16"/>
               </w:rPr>
-              <w:t>MUS 351–355, 360–369 Ensemble (four semesters)</w:t>
+              <w:t>MUS 351–355, 360–369 Ensemble (4 units)</w:t>
             </w:r>
           </w:p>
         </w:tc>
@@ -3269,7 +3269,7 @@
                 <w:b w:val="0"/>
                 <w:sz w:val="16"/>
               </w:rPr>
-              <w:t>MUS 693 Graduate Music Capstone (four semesters)</w:t>
+              <w:t>MUS 693 Graduate Music Capstone (4 units)</w:t>
             </w:r>
           </w:p>
         </w:tc>

</xml_diff>